<commit_message>
TIS_hardware_compare_RobastDB adding emails module
</commit_message>
<xml_diff>
--- a/info/docs/compile/check_utilities.docx
+++ b/info/docs/compile/check_utilities.docx
@@ -263,6 +263,9 @@
       <w:pPr>
         <w:pStyle w:val="NoSpacing"/>
       </w:pPr>
+      <w:r>
+        <w:t xml:space="preserve"> </w:t>
+      </w:r>
     </w:p>
     <w:p>
       <w:pPr>
@@ -349,6 +352,58 @@
         </w:rPr>
         <w:t>; print('OK')"</w:t>
       </w:r>
+    </w:p>
+    <w:p>
+      <w:pPr>
+        <w:pStyle w:val="NoSpacing"/>
+        <w:rPr>
+          <w:color w:val="7030A0"/>
+        </w:rPr>
+      </w:pPr>
+    </w:p>
+    <w:p>
+      <w:pPr>
+        <w:pStyle w:val="NoSpacing"/>
+        <w:rPr>
+          <w:color w:val="7030A0"/>
+        </w:rPr>
+      </w:pPr>
+      <w:proofErr w:type="spellStart"/>
+      <w:r>
+        <w:rPr>
+          <w:color w:val="7030A0"/>
+        </w:rPr>
+        <w:t>findstr</w:t>
+      </w:r>
+      <w:proofErr w:type="spellEnd"/>
+      <w:r>
+        <w:rPr>
+          <w:color w:val="7030A0"/>
+        </w:rPr>
+        <w:t xml:space="preserve"> /r /</w:t>
+      </w:r>
+      <w:proofErr w:type="spellStart"/>
+      <w:r>
+        <w:rPr>
+          <w:color w:val="7030A0"/>
+        </w:rPr>
+        <w:t>i</w:t>
+      </w:r>
+      <w:proofErr w:type="spellEnd"/>
+      <w:r>
+        <w:rPr>
+          <w:color w:val="7030A0"/>
+        </w:rPr>
+        <w:t xml:space="preserve"> /s "notes" *.</w:t>
+      </w:r>
+      <w:proofErr w:type="spellStart"/>
+      <w:r>
+        <w:rPr>
+          <w:color w:val="7030A0"/>
+        </w:rPr>
+        <w:t>py</w:t>
+      </w:r>
+      <w:proofErr w:type="spellEnd"/>
     </w:p>
     <w:sectPr>
       <w:pgSz w:w="12240" w:h="15840"/>

</xml_diff>